<commit_message>
docs: reframe admin guide for volunteer operators
</commit_message>
<xml_diff>
--- a/docs/KLOL_GG_관리자_기능_교육자료_2026-08-26.docx
+++ b/docs/KLOL_GG_관리자_기능_교육자료_2026-08-26.docx
@@ -39,7 +39,7 @@
           <w:color w:val="7A5A00"/>
           <w:sz w:val="20"/>
         </w:rPr>
-        <w:t>K-LOL.GG ADMIN TRAINING</w:t>
+        <w:t>K-LOL.GG 운영진 안내</w:t>
       </w:r>
     </w:p>
     <w:p>
@@ -54,7 +54,7 @@
           <w:color w:val="0B2545"/>
           <w:sz w:val="54"/>
         </w:rPr>
-        <w:t>K-LOL.GG 관리자 기능 교육자료</w:t>
+        <w:t>K-LOL.GG 운영진 기능 가이드</w:t>
       </w:r>
     </w:p>
     <w:p>
@@ -68,7 +68,7 @@
           <w:color w:val="1F4D78"/>
           <w:sz w:val="27"/>
         </w:rPr>
-        <w:t>신규·기존 관리자 공통 실무 교육 · 시나리오 실습 · 운영 체크리스트</w:t>
+        <w:t>자원 운영진을 위한 사이트 · 카카오봇 · 경고 · 내전 안내</w:t>
       </w:r>
     </w:p>
     <w:p>
@@ -83,7 +83,7 @@
           <w:color w:val="5C6773"/>
           <w:sz w:val="21"/>
         </w:rPr>
-        <w:t>2026-08-26  |  운영·교육용 완성본</w:t>
+        <w:t>2026-08-26  |  운영진 공유용</w:t>
       </w:r>
     </w:p>
     <w:p>
@@ -99,7 +99,7 @@
           <w:color w:val="5C6773"/>
           <w:sz w:val="21"/>
         </w:rPr>
-        <w:t>관리자가 접수 확인부터 승인·반려, 수기 확정, 로그 점검과 장애 보고까지 같은 기준으로 처리하도록 만든 교육용 실무 교재입니다.</w:t>
+        <w:t>처음 보는 운영진도 화면을 함께 보며 경고·내전·운영 기능을 편하게 설명하고 사용할 수 있도록 만든 안내서입니다.</w:t>
       </w:r>
     </w:p>
     <w:p>
@@ -113,7 +113,7 @@
           <w:color w:val="9B1C1C"/>
           <w:sz w:val="19"/>
         </w:rPr>
-        <w:t>교육 중 실제 제재·삭제 금지 · 사진 저장은 Vercel Blob 연결 후 최종 실습</w:t>
+        <w:t>연습 중 실제 제재·삭제 금지 · 애매한 판단은 운영진과 먼저 상의</w:t>
       </w:r>
     </w:p>
     <w:p>
@@ -131,7 +131,7 @@
           <w:color w:val="2E74B5"/>
           <w:sz w:val="32"/>
         </w:rPr>
-        <w:t>1. 교육 목표와 수료 기준</w:t>
+        <w:t>1. 이 가이드를 보는 방법</w:t>
       </w:r>
     </w:p>
     <w:p>
@@ -139,7 +139,7 @@
         <w:rPr>
           <w:rFonts w:ascii="Malgun Gothic" w:hAnsi="Malgun Gothic" w:eastAsia="Malgun Gothic" w:cs="Malgun Gothic"/>
         </w:rPr>
-        <w:t>이 자료는 관리자에게 모든 메뉴를 나열하는 데 그치지 않고, 실제 접수가 들어왔을 때 무엇을 먼저 확인하고 어떤 근거를 남겨야 하는지 교육하기 위한 실무 교재다.</w:t>
+        <w:t>이 자료는 회사식 근무 매뉴얼이나 평가표가 아니다. 자원해서 운영을 돕는 사람이 사이트와 카카오봇을 처음 배울 때, 옆에서 화면을 보여주며 말로 설명하기 위한 안내서다.</w:t>
       </w:r>
     </w:p>
     <w:p>
@@ -147,7 +147,7 @@
         <w:rPr>
           <w:rFonts w:ascii="Malgun Gothic" w:hAnsi="Malgun Gothic" w:eastAsia="Malgun Gothic" w:cs="Malgun Gothic"/>
         </w:rPr>
-        <w:t>교육을 마친 관리자는 다음 업무를 혼자 수행할 수 있어야 한다.</w:t>
+        <w:t>처음부터 전부 외울 필요는 없다. 아래 세 가지 흐름을 먼저 이해하고, 나머지 메뉴는 필요한 상황이 생겼을 때 찾아보면 된다.</w:t>
       </w:r>
     </w:p>
     <w:p>
@@ -158,7 +158,48 @@
         <w:rPr>
           <w:rFonts w:ascii="Malgun Gothic" w:hAnsi="Malgun Gothic" w:eastAsia="Malgun Gothic" w:cs="Malgun Gothic"/>
         </w:rPr>
-        <w:t>관리자 홈에서 오늘 처리할 업무와 오류를 구분한다.</w:t>
+        <w:t>내전: 카카오 접수 → 사진 확인 → 사이트에서 수기 등록</w:t>
+      </w:r>
+    </w:p>
+    <w:p>
+      <w:pPr>
+        <w:pStyle w:val="ListBullet"/>
+      </w:pPr>
+      <w:r>
+        <w:rPr>
+          <w:rFonts w:ascii="Malgun Gothic" w:hAnsi="Malgun Gothic" w:eastAsia="Malgun Gothic" w:cs="Malgun Gothic"/>
+        </w:rPr>
+        <w:t>경고: 카카오 접수 → 관리자 검토 → 승인·반려 → 차감 인증</w:t>
+      </w:r>
+    </w:p>
+    <w:p>
+      <w:pPr>
+        <w:pStyle w:val="ListBullet"/>
+      </w:pPr>
+      <w:r>
+        <w:rPr>
+          <w:rFonts w:ascii="Malgun Gothic" w:hAnsi="Malgun Gothic" w:eastAsia="Malgun Gothic" w:cs="Malgun Gothic"/>
+        </w:rPr>
+        <w:t>운영: 구인·신청·오류를 확인하고 필요한 사람과 상의</w:t>
+      </w:r>
+    </w:p>
+    <w:p>
+      <w:r>
+        <w:rPr>
+          <w:rFonts w:ascii="Malgun Gothic" w:hAnsi="Malgun Gothic" w:eastAsia="Malgun Gothic" w:cs="Malgun Gothic"/>
+        </w:rPr>
+        <w:t>이 가이드를 함께 본 뒤에는 다음 내용을 편하게 설명할 수 있으면 충분하다.</w:t>
+      </w:r>
+    </w:p>
+    <w:p>
+      <w:pPr>
+        <w:pStyle w:val="ListBullet"/>
+      </w:pPr>
+      <w:r>
+        <w:rPr>
+          <w:rFonts w:ascii="Malgun Gothic" w:hAnsi="Malgun Gothic" w:eastAsia="Malgun Gothic" w:cs="Malgun Gothic"/>
+        </w:rPr>
+        <w:t>관리자 홈에서 접수와 오류가 어디에 보이는지 찾는다.</w:t>
       </w:r>
     </w:p>
     <w:p>
@@ -180,7 +221,7 @@
         <w:rPr>
           <w:rFonts w:ascii="Malgun Gothic" w:hAnsi="Malgun Gothic" w:eastAsia="Malgun Gothic" w:cs="Malgun Gothic"/>
         </w:rPr>
-        <w:t>경고 접수를 승인·반려하고 비공개 사유를 안전하게 기록한다.</w:t>
+        <w:t>경고 접수를 검토하고 비공개 사유를 안전하게 기록한다.</w:t>
       </w:r>
     </w:p>
     <w:p>
@@ -224,7 +265,7 @@
         <w:rPr>
           <w:rFonts w:ascii="Malgun Gothic" w:hAnsi="Malgun Gothic" w:eastAsia="Malgun Gothic" w:cs="Malgun Gothic"/>
         </w:rPr>
-        <w:t>장애 발생 시 임의 수정하지 않고 로그와 재현 정보를 수집해 보고한다.</w:t>
+        <w:t>잘 모르거나 애매한 상황에서 혼자 결정하지 않고 다른 운영진에게 물어본다.</w:t>
       </w:r>
     </w:p>
     <w:p>
@@ -241,7 +282,7 @@
           <w:color w:val="0B2545"/>
           <w:sz w:val="21"/>
         </w:rPr>
-        <w:t>교육 실습에서는 실제 이용자에게 경고·벤을 부여하거나 운영 데이터를 삭제하지 않는다. 테스트 접수와 조회 기능만 사용하고, 승인 실습은 지정된 테스트 대상에 한정한다.</w:t>
+        <w:t>같이 연습할 때는 실제 이용자에게 경고·벤을 부여하거나 운영 데이터를 삭제하지 않는다. 테스트 접수와 조회 기능만 사용하고, 승인 연습은 지정된 테스트 대상에 한정한다.</w:t>
       </w:r>
     </w:p>
     <w:p>
@@ -259,7 +300,15 @@
           <w:color w:val="2E74B5"/>
           <w:sz w:val="32"/>
         </w:rPr>
-        <w:t>2. 교육 진행안</w:t>
+        <w:t>2. 말로 설명할 때 추천 순서</w:t>
+      </w:r>
+    </w:p>
+    <w:p>
+      <w:r>
+        <w:rPr>
+          <w:rFonts w:ascii="Malgun Gothic" w:hAnsi="Malgun Gothic" w:eastAsia="Malgun Gothic" w:cs="Malgun Gothic"/>
+        </w:rPr>
+        <w:t>한 번에 모든 메뉴를 설명하면 기억하기 어렵다. 실제 화면을 함께 보면서 다음 순서로 이야기하는 것을 권장한다.</w:t>
       </w:r>
     </w:p>
     <w:tbl>
@@ -317,7 +366,7 @@
                 <w:color w:val="0B2545"/>
                 <w:sz w:val="17"/>
               </w:rPr>
-              <w:t>단계</w:t>
+              <w:t>순서</w:t>
             </w:r>
           </w:p>
         </w:tc>
@@ -383,7 +432,7 @@
                 <w:color w:val="0B2545"/>
                 <w:sz w:val="17"/>
               </w:rPr>
-              <w:t>교육 내용</w:t>
+              <w:t>함께 볼 내용</w:t>
             </w:r>
           </w:p>
         </w:tc>
@@ -416,7 +465,7 @@
                 <w:color w:val="0B2545"/>
                 <w:sz w:val="17"/>
               </w:rPr>
-              <w:t>수료 증거</w:t>
+              <w:t>확인해 볼 것</w:t>
             </w:r>
           </w:p>
         </w:tc>
@@ -450,7 +499,7 @@
                 <w:color w:val="0B2545"/>
                 <w:sz w:val="17"/>
               </w:rPr>
-              <w:t>1. 기본 이해</w:t>
+              <w:t>1. 전체 모습</w:t>
             </w:r>
           </w:p>
         </w:tc>
@@ -476,7 +525,7 @@
                 <w:color w:val="0B2545"/>
                 <w:sz w:val="17"/>
               </w:rPr>
-              <w:t>15분</w:t>
+              <w:t>10분</w:t>
             </w:r>
           </w:p>
         </w:tc>
@@ -502,7 +551,7 @@
                 <w:color w:val="0B2545"/>
                 <w:sz w:val="17"/>
               </w:rPr>
-              <w:t>역할, 권한, 접수번호, 금지 행동</w:t>
+              <w:t>관리자 홈, 메뉴, 접수번호</w:t>
             </w:r>
           </w:p>
         </w:tc>
@@ -528,7 +577,7 @@
                 <w:color w:val="0B2545"/>
                 <w:sz w:val="17"/>
               </w:rPr>
-              <w:t>용어 확인 질문 통과</w:t>
+              <w:t>경고·내전 메뉴 위치 찾기</w:t>
             </w:r>
           </w:p>
         </w:tc>
@@ -562,7 +611,7 @@
                 <w:color w:val="0B2545"/>
                 <w:sz w:val="17"/>
               </w:rPr>
-              <w:t>2. 사이트 탐색</w:t>
+              <w:t>2. 경고</w:t>
             </w:r>
           </w:p>
         </w:tc>
@@ -588,7 +637,7 @@
                 <w:color w:val="0B2545"/>
                 <w:sz w:val="17"/>
               </w:rPr>
-              <w:t>20분</w:t>
+              <w:t>20~30분</w:t>
             </w:r>
           </w:p>
         </w:tc>
@@ -614,7 +663,7 @@
                 <w:color w:val="0B2545"/>
                 <w:sz w:val="17"/>
               </w:rPr>
-              <w:t>관리자 홈과 주요 메뉴 위치</w:t>
+              <w:t>접수, 근거사진, 승인·반려, 차감</w:t>
             </w:r>
           </w:p>
         </w:tc>
@@ -640,7 +689,7 @@
                 <w:color w:val="0B2545"/>
                 <w:sz w:val="17"/>
               </w:rPr>
-              <w:t>지정 메뉴 5개 직접 찾기</w:t>
+              <w:t>0~3장과 10·15장 구분하기</w:t>
             </w:r>
           </w:p>
         </w:tc>
@@ -674,7 +723,7 @@
                 <w:color w:val="0B2545"/>
                 <w:sz w:val="17"/>
               </w:rPr>
-              <w:t>3. 카카오 운영</w:t>
+              <w:t>3. 내전</w:t>
             </w:r>
           </w:p>
         </w:tc>
@@ -700,7 +749,119 @@
                 <w:color w:val="0B2545"/>
                 <w:sz w:val="17"/>
               </w:rPr>
-              <w:t>25분</w:t>
+              <w:t>20~30분</w:t>
+            </w:r>
+          </w:p>
+        </w:tc>
+        <w:tc>
+          <w:tcPr>
+            <w:tcW w:type="dxa" w:w="1800"/>
+            <w:vAlign w:val="center"/>
+            <w:tcMar>
+              <w:top w:w="80" w:type="dxa"/>
+              <w:start w:w="120" w:type="dxa"/>
+              <w:bottom w:w="80" w:type="dxa"/>
+              <w:end w:w="120" w:type="dxa"/>
+            </w:tcMar>
+          </w:tcPr>
+          <w:p>
+            <w:pPr>
+              <w:spacing w:before="0" w:after="0" w:line="269" w:lineRule="auto"/>
+            </w:pPr>
+            <w:r/>
+            <w:r>
+              <w:rPr>
+                <w:rFonts w:ascii="Malgun Gothic" w:hAnsi="Malgun Gothic" w:eastAsia="Malgun Gothic" w:cs="Malgun Gothic"/>
+                <w:color w:val="0B2545"/>
+                <w:sz w:val="17"/>
+              </w:rPr>
+              <w:t>2·3세트 사진, 접수 확인, 수기 등록</w:t>
+            </w:r>
+          </w:p>
+        </w:tc>
+        <w:tc>
+          <w:tcPr>
+            <w:tcW w:type="dxa" w:w="3860"/>
+            <w:vAlign w:val="center"/>
+            <w:tcMar>
+              <w:top w:w="80" w:type="dxa"/>
+              <w:start w:w="120" w:type="dxa"/>
+              <w:bottom w:w="80" w:type="dxa"/>
+              <w:end w:w="120" w:type="dxa"/>
+            </w:tcMar>
+          </w:tcPr>
+          <w:p>
+            <w:pPr>
+              <w:spacing w:before="0" w:after="0" w:line="269" w:lineRule="auto"/>
+            </w:pPr>
+            <w:r/>
+            <w:r>
+              <w:rPr>
+                <w:rFonts w:ascii="Malgun Gothic" w:hAnsi="Malgun Gothic" w:eastAsia="Malgun Gothic" w:cs="Malgun Gothic"/>
+                <w:color w:val="0B2545"/>
+                <w:sz w:val="17"/>
+              </w:rPr>
+              <w:t>사진 순서와 등록 화면 연결하기</w:t>
+            </w:r>
+          </w:p>
+        </w:tc>
+      </w:tr>
+      <w:tr>
+        <w:tc>
+          <w:tcPr>
+            <w:tcW w:type="dxa" w:w="1400"/>
+            <w:vAlign w:val="center"/>
+            <w:tcMar>
+              <w:top w:w="80" w:type="dxa"/>
+              <w:start w:w="120" w:type="dxa"/>
+              <w:bottom w:w="80" w:type="dxa"/>
+              <w:end w:w="120" w:type="dxa"/>
+            </w:tcMar>
+            <w:shd w:fill="F4F6F9"/>
+          </w:tcPr>
+          <w:p>
+            <w:pPr>
+              <w:spacing w:before="0" w:after="0" w:line="269" w:lineRule="auto"/>
+            </w:pPr>
+            <w:r>
+              <w:rPr>
+                <w:b/>
+              </w:rPr>
+            </w:r>
+            <w:r>
+              <w:rPr>
+                <w:rFonts w:ascii="Malgun Gothic" w:hAnsi="Malgun Gothic" w:eastAsia="Malgun Gothic" w:cs="Malgun Gothic"/>
+                <w:b/>
+                <w:color w:val="0B2545"/>
+                <w:sz w:val="17"/>
+              </w:rPr>
+              <w:t>4. 카카오 운영</w:t>
+            </w:r>
+          </w:p>
+        </w:tc>
+        <w:tc>
+          <w:tcPr>
+            <w:tcW w:type="dxa" w:w="2300"/>
+            <w:vAlign w:val="center"/>
+            <w:tcMar>
+              <w:top w:w="80" w:type="dxa"/>
+              <w:start w:w="120" w:type="dxa"/>
+              <w:bottom w:w="80" w:type="dxa"/>
+              <w:end w:w="120" w:type="dxa"/>
+            </w:tcMar>
+          </w:tcPr>
+          <w:p>
+            <w:pPr>
+              <w:spacing w:before="0" w:after="0" w:line="269" w:lineRule="auto"/>
+            </w:pPr>
+            <w:r/>
+            <w:r>
+              <w:rPr>
+                <w:rFonts w:ascii="Malgun Gothic" w:hAnsi="Malgun Gothic" w:eastAsia="Malgun Gothic" w:cs="Malgun Gothic"/>
+                <w:color w:val="0B2545"/>
+                <w:sz w:val="17"/>
+              </w:rPr>
+              <w:t>15~20분</w:t>
             </w:r>
           </w:p>
         </w:tc>
@@ -752,7 +913,7 @@
                 <w:color w:val="0B2545"/>
                 <w:sz w:val="17"/>
               </w:rPr>
-              <w:t>명령별 결과 설명</w:t>
+              <w:t>모집번호가 왜 필요한지 설명하기</w:t>
             </w:r>
           </w:p>
         </w:tc>
@@ -786,7 +947,7 @@
                 <w:color w:val="0B2545"/>
                 <w:sz w:val="17"/>
               </w:rPr>
-              <w:t>4. 경고 처리</w:t>
+              <w:t>5. 애매한 상황</w:t>
             </w:r>
           </w:p>
         </w:tc>
@@ -812,7 +973,7 @@
                 <w:color w:val="0B2545"/>
                 <w:sz w:val="17"/>
               </w:rPr>
-              <w:t>35분</w:t>
+              <w:t>10분</w:t>
             </w:r>
           </w:p>
         </w:tc>
@@ -838,7 +999,7 @@
                 <w:color w:val="0B2545"/>
                 <w:sz w:val="17"/>
               </w:rPr>
-              <w:t>접수, 증빙, 승인·반려, 차감</w:t>
+              <w:t>보류, 운영진 상의, 오류 기록</w:t>
             </w:r>
           </w:p>
         </w:tc>
@@ -864,343 +1025,7 @@
                 <w:color w:val="0B2545"/>
                 <w:sz w:val="17"/>
               </w:rPr>
-              <w:t>테스트 경고 처리</w:t>
-            </w:r>
-          </w:p>
-        </w:tc>
-      </w:tr>
-      <w:tr>
-        <w:tc>
-          <w:tcPr>
-            <w:tcW w:type="dxa" w:w="1400"/>
-            <w:vAlign w:val="center"/>
-            <w:tcMar>
-              <w:top w:w="80" w:type="dxa"/>
-              <w:start w:w="120" w:type="dxa"/>
-              <w:bottom w:w="80" w:type="dxa"/>
-              <w:end w:w="120" w:type="dxa"/>
-            </w:tcMar>
-            <w:shd w:fill="F4F6F9"/>
-          </w:tcPr>
-          <w:p>
-            <w:pPr>
-              <w:spacing w:before="0" w:after="0" w:line="269" w:lineRule="auto"/>
-            </w:pPr>
-            <w:r>
-              <w:rPr>
-                <w:b/>
-              </w:rPr>
-            </w:r>
-            <w:r>
-              <w:rPr>
-                <w:rFonts w:ascii="Malgun Gothic" w:hAnsi="Malgun Gothic" w:eastAsia="Malgun Gothic" w:cs="Malgun Gothic"/>
-                <w:b/>
-                <w:color w:val="0B2545"/>
-                <w:sz w:val="17"/>
-              </w:rPr>
-              <w:t>5. 내전 결과</w:t>
-            </w:r>
-          </w:p>
-        </w:tc>
-        <w:tc>
-          <w:tcPr>
-            <w:tcW w:type="dxa" w:w="2300"/>
-            <w:vAlign w:val="center"/>
-            <w:tcMar>
-              <w:top w:w="80" w:type="dxa"/>
-              <w:start w:w="120" w:type="dxa"/>
-              <w:bottom w:w="80" w:type="dxa"/>
-              <w:end w:w="120" w:type="dxa"/>
-            </w:tcMar>
-          </w:tcPr>
-          <w:p>
-            <w:pPr>
-              <w:spacing w:before="0" w:after="0" w:line="269" w:lineRule="auto"/>
-            </w:pPr>
-            <w:r/>
-            <w:r>
-              <w:rPr>
-                <w:rFonts w:ascii="Malgun Gothic" w:hAnsi="Malgun Gothic" w:eastAsia="Malgun Gothic" w:cs="Malgun Gothic"/>
-                <w:color w:val="0B2545"/>
-                <w:sz w:val="17"/>
-              </w:rPr>
-              <w:t>30분</w:t>
-            </w:r>
-          </w:p>
-        </w:tc>
-        <w:tc>
-          <w:tcPr>
-            <w:tcW w:type="dxa" w:w="1800"/>
-            <w:vAlign w:val="center"/>
-            <w:tcMar>
-              <w:top w:w="80" w:type="dxa"/>
-              <w:start w:w="120" w:type="dxa"/>
-              <w:bottom w:w="80" w:type="dxa"/>
-              <w:end w:w="120" w:type="dxa"/>
-            </w:tcMar>
-          </w:tcPr>
-          <w:p>
-            <w:pPr>
-              <w:spacing w:before="0" w:after="0" w:line="269" w:lineRule="auto"/>
-            </w:pPr>
-            <w:r/>
-            <w:r>
-              <w:rPr>
-                <w:rFonts w:ascii="Malgun Gothic" w:hAnsi="Malgun Gothic" w:eastAsia="Malgun Gothic" w:cs="Malgun Gothic"/>
-                <w:color w:val="0B2545"/>
-                <w:sz w:val="17"/>
-              </w:rPr>
-              <w:t>2·3세트 사진, 수기 등록 연결</w:t>
-            </w:r>
-          </w:p>
-        </w:tc>
-        <w:tc>
-          <w:tcPr>
-            <w:tcW w:type="dxa" w:w="3860"/>
-            <w:vAlign w:val="center"/>
-            <w:tcMar>
-              <w:top w:w="80" w:type="dxa"/>
-              <w:start w:w="120" w:type="dxa"/>
-              <w:bottom w:w="80" w:type="dxa"/>
-              <w:end w:w="120" w:type="dxa"/>
-            </w:tcMar>
-          </w:tcPr>
-          <w:p>
-            <w:pPr>
-              <w:spacing w:before="0" w:after="0" w:line="269" w:lineRule="auto"/>
-            </w:pPr>
-            <w:r/>
-            <w:r>
-              <w:rPr>
-                <w:rFonts w:ascii="Malgun Gothic" w:hAnsi="Malgun Gothic" w:eastAsia="Malgun Gothic" w:cs="Malgun Gothic"/>
-                <w:color w:val="0B2545"/>
-                <w:sz w:val="17"/>
-              </w:rPr>
-              <w:t>테스트 내전 접수 확인</w:t>
-            </w:r>
-          </w:p>
-        </w:tc>
-      </w:tr>
-      <w:tr>
-        <w:tc>
-          <w:tcPr>
-            <w:tcW w:type="dxa" w:w="1400"/>
-            <w:vAlign w:val="center"/>
-            <w:tcMar>
-              <w:top w:w="80" w:type="dxa"/>
-              <w:start w:w="120" w:type="dxa"/>
-              <w:bottom w:w="80" w:type="dxa"/>
-              <w:end w:w="120" w:type="dxa"/>
-            </w:tcMar>
-            <w:shd w:fill="F4F6F9"/>
-          </w:tcPr>
-          <w:p>
-            <w:pPr>
-              <w:spacing w:before="0" w:after="0" w:line="269" w:lineRule="auto"/>
-            </w:pPr>
-            <w:r>
-              <w:rPr>
-                <w:b/>
-              </w:rPr>
-            </w:r>
-            <w:r>
-              <w:rPr>
-                <w:rFonts w:ascii="Malgun Gothic" w:hAnsi="Malgun Gothic" w:eastAsia="Malgun Gothic" w:cs="Malgun Gothic"/>
-                <w:b/>
-                <w:color w:val="0B2545"/>
-                <w:sz w:val="17"/>
-              </w:rPr>
-              <w:t>6. 장애 대응</w:t>
-            </w:r>
-          </w:p>
-        </w:tc>
-        <w:tc>
-          <w:tcPr>
-            <w:tcW w:type="dxa" w:w="2300"/>
-            <w:vAlign w:val="center"/>
-            <w:tcMar>
-              <w:top w:w="80" w:type="dxa"/>
-              <w:start w:w="120" w:type="dxa"/>
-              <w:bottom w:w="80" w:type="dxa"/>
-              <w:end w:w="120" w:type="dxa"/>
-            </w:tcMar>
-          </w:tcPr>
-          <w:p>
-            <w:pPr>
-              <w:spacing w:before="0" w:after="0" w:line="269" w:lineRule="auto"/>
-            </w:pPr>
-            <w:r/>
-            <w:r>
-              <w:rPr>
-                <w:rFonts w:ascii="Malgun Gothic" w:hAnsi="Malgun Gothic" w:eastAsia="Malgun Gothic" w:cs="Malgun Gothic"/>
-                <w:color w:val="0B2545"/>
-                <w:sz w:val="17"/>
-              </w:rPr>
-              <w:t>20분</w:t>
-            </w:r>
-          </w:p>
-        </w:tc>
-        <w:tc>
-          <w:tcPr>
-            <w:tcW w:type="dxa" w:w="1800"/>
-            <w:vAlign w:val="center"/>
-            <w:tcMar>
-              <w:top w:w="80" w:type="dxa"/>
-              <w:start w:w="120" w:type="dxa"/>
-              <w:bottom w:w="80" w:type="dxa"/>
-              <w:end w:w="120" w:type="dxa"/>
-            </w:tcMar>
-          </w:tcPr>
-          <w:p>
-            <w:pPr>
-              <w:spacing w:before="0" w:after="0" w:line="269" w:lineRule="auto"/>
-            </w:pPr>
-            <w:r/>
-            <w:r>
-              <w:rPr>
-                <w:rFonts w:ascii="Malgun Gothic" w:hAnsi="Malgun Gothic" w:eastAsia="Malgun Gothic" w:cs="Malgun Gothic"/>
-                <w:color w:val="0B2545"/>
-                <w:sz w:val="17"/>
-              </w:rPr>
-              <w:t>오류 분류, 로그, 보고 양식</w:t>
-            </w:r>
-          </w:p>
-        </w:tc>
-        <w:tc>
-          <w:tcPr>
-            <w:tcW w:type="dxa" w:w="3860"/>
-            <w:vAlign w:val="center"/>
-            <w:tcMar>
-              <w:top w:w="80" w:type="dxa"/>
-              <w:start w:w="120" w:type="dxa"/>
-              <w:bottom w:w="80" w:type="dxa"/>
-              <w:end w:w="120" w:type="dxa"/>
-            </w:tcMar>
-          </w:tcPr>
-          <w:p>
-            <w:pPr>
-              <w:spacing w:before="0" w:after="0" w:line="269" w:lineRule="auto"/>
-            </w:pPr>
-            <w:r/>
-            <w:r>
-              <w:rPr>
-                <w:rFonts w:ascii="Malgun Gothic" w:hAnsi="Malgun Gothic" w:eastAsia="Malgun Gothic" w:cs="Malgun Gothic"/>
-                <w:color w:val="0B2545"/>
-                <w:sz w:val="17"/>
-              </w:rPr>
-              <w:t>장애 보고서 작성</w:t>
-            </w:r>
-          </w:p>
-        </w:tc>
-      </w:tr>
-      <w:tr>
-        <w:tc>
-          <w:tcPr>
-            <w:tcW w:type="dxa" w:w="1400"/>
-            <w:vAlign w:val="center"/>
-            <w:tcMar>
-              <w:top w:w="80" w:type="dxa"/>
-              <w:start w:w="120" w:type="dxa"/>
-              <w:bottom w:w="80" w:type="dxa"/>
-              <w:end w:w="120" w:type="dxa"/>
-            </w:tcMar>
-            <w:shd w:fill="F4F6F9"/>
-          </w:tcPr>
-          <w:p>
-            <w:pPr>
-              <w:spacing w:before="0" w:after="0" w:line="269" w:lineRule="auto"/>
-            </w:pPr>
-            <w:r>
-              <w:rPr>
-                <w:b/>
-              </w:rPr>
-            </w:r>
-            <w:r>
-              <w:rPr>
-                <w:rFonts w:ascii="Malgun Gothic" w:hAnsi="Malgun Gothic" w:eastAsia="Malgun Gothic" w:cs="Malgun Gothic"/>
-                <w:b/>
-                <w:color w:val="0B2545"/>
-                <w:sz w:val="17"/>
-              </w:rPr>
-              <w:t>7. 평가</w:t>
-            </w:r>
-          </w:p>
-        </w:tc>
-        <w:tc>
-          <w:tcPr>
-            <w:tcW w:type="dxa" w:w="2300"/>
-            <w:vAlign w:val="center"/>
-            <w:tcMar>
-              <w:top w:w="80" w:type="dxa"/>
-              <w:start w:w="120" w:type="dxa"/>
-              <w:bottom w:w="80" w:type="dxa"/>
-              <w:end w:w="120" w:type="dxa"/>
-            </w:tcMar>
-          </w:tcPr>
-          <w:p>
-            <w:pPr>
-              <w:spacing w:before="0" w:after="0" w:line="269" w:lineRule="auto"/>
-            </w:pPr>
-            <w:r/>
-            <w:r>
-              <w:rPr>
-                <w:rFonts w:ascii="Malgun Gothic" w:hAnsi="Malgun Gothic" w:eastAsia="Malgun Gothic" w:cs="Malgun Gothic"/>
-                <w:color w:val="0B2545"/>
-                <w:sz w:val="17"/>
-              </w:rPr>
-              <w:t>15분</w:t>
-            </w:r>
-          </w:p>
-        </w:tc>
-        <w:tc>
-          <w:tcPr>
-            <w:tcW w:type="dxa" w:w="1800"/>
-            <w:vAlign w:val="center"/>
-            <w:tcMar>
-              <w:top w:w="80" w:type="dxa"/>
-              <w:start w:w="120" w:type="dxa"/>
-              <w:bottom w:w="80" w:type="dxa"/>
-              <w:end w:w="120" w:type="dxa"/>
-            </w:tcMar>
-          </w:tcPr>
-          <w:p>
-            <w:pPr>
-              <w:spacing w:before="0" w:after="0" w:line="269" w:lineRule="auto"/>
-            </w:pPr>
-            <w:r/>
-            <w:r>
-              <w:rPr>
-                <w:rFonts w:ascii="Malgun Gothic" w:hAnsi="Malgun Gothic" w:eastAsia="Malgun Gothic" w:cs="Malgun Gothic"/>
-                <w:color w:val="0B2545"/>
-                <w:sz w:val="17"/>
-              </w:rPr>
-              <w:t>체크리스트와 질의응답</w:t>
-            </w:r>
-          </w:p>
-        </w:tc>
-        <w:tc>
-          <w:tcPr>
-            <w:tcW w:type="dxa" w:w="3860"/>
-            <w:vAlign w:val="center"/>
-            <w:tcMar>
-              <w:top w:w="80" w:type="dxa"/>
-              <w:start w:w="120" w:type="dxa"/>
-              <w:bottom w:w="80" w:type="dxa"/>
-              <w:end w:w="120" w:type="dxa"/>
-            </w:tcMar>
-          </w:tcPr>
-          <w:p>
-            <w:pPr>
-              <w:spacing w:before="0" w:after="0" w:line="269" w:lineRule="auto"/>
-            </w:pPr>
-            <w:r/>
-            <w:r>
-              <w:rPr>
-                <w:rFonts w:ascii="Malgun Gothic" w:hAnsi="Malgun Gothic" w:eastAsia="Malgun Gothic" w:cs="Malgun Gothic"/>
-                <w:color w:val="0B2545"/>
-                <w:sz w:val="17"/>
-              </w:rPr>
-              <w:t>최종 체크리스트 서명</w:t>
+              <w:t>혼자 처리하지 않을 경우 구분하기</w:t>
             </w:r>
           </w:p>
         </w:tc>
@@ -1221,7 +1046,7 @@
           <w:color w:val="2E74B5"/>
           <w:sz w:val="26"/>
         </w:rPr>
-        <w:t>교육 전 준비</w:t>
+        <w:t>같이 보기 전 준비</w:t>
       </w:r>
     </w:p>
     <w:p>
@@ -1232,7 +1057,7 @@
         <w:rPr>
           <w:rFonts w:ascii="Malgun Gothic" w:hAnsi="Malgun Gothic" w:eastAsia="Malgun Gothic" w:cs="Malgun Gothic"/>
         </w:rPr>
-        <w:t>교육용 관리자 계정과 역할을 확인한다.</w:t>
+        <w:t>사용할 관리자 계정과 권한 범위를 확인한다.</w:t>
       </w:r>
     </w:p>
     <w:p>
@@ -1276,7 +1101,7 @@
         <w:rPr>
           <w:rFonts w:ascii="Malgun Gothic" w:hAnsi="Malgun Gothic" w:eastAsia="Malgun Gothic" w:cs="Malgun Gothic"/>
         </w:rPr>
-        <w:t>현재 사진 저장은 Vercel Blob 인증 문제로 성공 실습이 제한됨을 공지한다.</w:t>
+        <w:t>현재 사진 저장은 Vercel Blob 인증 문제로 성공 테스트가 제한될 수 있음을 먼저 알려준다.</w:t>
       </w:r>
     </w:p>
     <w:p>
@@ -1384,7 +1209,7 @@
                 <w:color w:val="0B2545"/>
                 <w:sz w:val="17"/>
               </w:rPr>
-              <w:t>담당 업무</w:t>
+              <w:t>주로 돕는 내용</w:t>
             </w:r>
           </w:p>
         </w:tc>
@@ -1623,7 +1448,7 @@
                 <w:color w:val="0B2545"/>
                 <w:sz w:val="17"/>
               </w:rPr>
-              <w:t>교육 진행자</w:t>
+              <w:t>설명을 맡은 관리자</w:t>
             </w:r>
           </w:p>
         </w:tc>
@@ -1649,7 +1474,7 @@
                 <w:color w:val="0B2545"/>
                 <w:sz w:val="17"/>
               </w:rPr>
-              <w:t>테스트 범위 지정, 실습 감독, 수료 확인</w:t>
+              <w:t>화면을 같이 보며 기능과 주의점을 안내</w:t>
             </w:r>
           </w:p>
         </w:tc>
@@ -1675,7 +1500,7 @@
                 <w:color w:val="0B2545"/>
                 <w:sz w:val="17"/>
               </w:rPr>
-              <w:t>실습을 실제 이용자 데이터로 진행</w:t>
+              <w:t>연습을 실제 이용자 데이터로 진행</w:t>
             </w:r>
           </w:p>
         </w:tc>
@@ -1691,7 +1516,7 @@
         <w:rPr>
           <w:rFonts w:ascii="Malgun Gothic" w:hAnsi="Malgun Gothic" w:eastAsia="Malgun Gothic" w:cs="Malgun Gothic"/>
         </w:rPr>
-        <w:t xml:space="preserve">모든 관리자 작업은 </w:t>
+        <w:t xml:space="preserve">관리자 처리는 </w:t>
       </w:r>
       <w:r>
         <w:rPr>
@@ -1705,7 +1530,24 @@
         <w:rPr>
           <w:rFonts w:ascii="Malgun Gothic" w:hAnsi="Malgun Gothic" w:eastAsia="Malgun Gothic" w:cs="Malgun Gothic"/>
         </w:rPr>
-        <w:t xml:space="preserve"> 추적 가능해야 한다. 불확실하면 승인하지 말고 보류한 뒤 다른 관리자와 근거를 확인한다.</w:t>
+        <w:t xml:space="preserve"> 나중에 확인할 수 있어야 한다. 불확실하면 승인하지 말고 보류한 뒤 다른 운영진과 근거를 확인한다.</w:t>
+      </w:r>
+    </w:p>
+    <w:p>
+      <w:pPr>
+        <w:pStyle w:val="Callout"/>
+        <w:shd w:fill="E8EEF5"/>
+        <w:pBdr>
+          <w:left w:val="single" w:sz="18" w:space="8" w:color="2E74B5"/>
+        </w:pBdr>
+      </w:pPr>
+      <w:r>
+        <w:rPr>
+          <w:rFonts w:ascii="Malgun Gothic" w:hAnsi="Malgun Gothic" w:eastAsia="Malgun Gothic" w:cs="Malgun Gothic"/>
+          <w:color w:val="0B2545"/>
+          <w:sz w:val="21"/>
+        </w:rPr>
+        <w:t>일반 관리자는 계정·권한 변경, 전체 데이터 삭제, 번호 초기화, 시즌 종료, 비밀값 변경처럼 영향이 큰 기능을 직접 처리하지 않는다. 이런 기능은 최고관리자와 먼저 상의한다.</w:t>
       </w:r>
     </w:p>
     <w:p>
@@ -1813,7 +1655,7 @@
         <w:rPr>
           <w:rFonts w:ascii="Malgun Gothic" w:hAnsi="Malgun Gothic" w:eastAsia="Malgun Gothic" w:cs="Malgun Gothic"/>
         </w:rPr>
-        <w:t>에서 미처리 접수, 오류, 자동화 상태를 먼저 확인한다. 메뉴 검색을 이용하면 기능 이름이나 업무 키워드로 빠르게 이동할 수 있다.</w:t>
+        <w:t>에서 접수, 오류, 자동화 상태를 확인할 수 있다. 메뉴 검색을 이용하면 기능 이름이나 상황 키워드로 빠르게 이동할 수 있다.</w:t>
       </w:r>
     </w:p>
     <w:p>
@@ -1831,7 +1673,7 @@
         <w:drawing>
           <wp:inline xmlns:a="http://schemas.openxmlformats.org/drawingml/2006/main" xmlns:pic="http://schemas.openxmlformats.org/drawingml/2006/picture">
             <wp:extent cx="5760720" cy="4050506"/>
-            <wp:docPr id="1" name="Picture 1" descr="관리자 홈: 왼쪽 업무 메뉴와 오늘 운영 현황을 확인하는 시작 화면" title="관리자 홈: 왼쪽 업무 메뉴와 오늘 운영 현황을 확인하는 시작 화면"/>
+            <wp:docPr id="1" name="Picture 1" descr="관리자 홈: 왼쪽 메뉴와 현재 운영 현황을 확인하는 시작 화면" title="관리자 홈: 왼쪽 메뉴와 현재 운영 현황을 확인하는 시작 화면"/>
             <wp:cNvGraphicFramePr>
               <a:graphicFrameLocks noChangeAspect="1"/>
             </wp:cNvGraphicFramePr>
@@ -1874,7 +1716,7 @@
           <w:color w:val="5C6773"/>
           <w:sz w:val="18"/>
         </w:rPr>
-        <w:t>관리자 홈: 왼쪽 업무 메뉴와 오늘 운영 현황을 확인하는 시작 화면</w:t>
+        <w:t>관리자 홈: 왼쪽 메뉴와 현재 운영 현황을 확인하는 시작 화면</w:t>
       </w:r>
     </w:p>
     <w:tbl>
@@ -1931,7 +1773,7 @@
                 <w:color w:val="0B2545"/>
                 <w:sz w:val="17"/>
               </w:rPr>
-              <w:t>업무</w:t>
+              <w:t>하고 싶은 일</w:t>
             </w:r>
           </w:p>
         </w:tc>
@@ -2031,7 +1873,7 @@
                 <w:color w:val="0B2545"/>
                 <w:sz w:val="17"/>
               </w:rPr>
-              <w:t>오늘 현황</w:t>
+              <w:t>전체 현황 보기</w:t>
             </w:r>
           </w:p>
         </w:tc>
@@ -2083,7 +1925,7 @@
                 <w:color w:val="0B2545"/>
                 <w:sz w:val="17"/>
               </w:rPr>
-              <w:t>근무 시작과 인수인계 때</w:t>
+              <w:t>접수나 오류가 있는지 궁금할 때</w:t>
             </w:r>
           </w:p>
         </w:tc>
@@ -3149,7 +2991,7 @@
           <w:color w:val="2E74B5"/>
           <w:sz w:val="32"/>
         </w:rPr>
-        <w:t>5. 근무 시작·종료 표준 절차</w:t>
+        <w:t>5. 관리 페이지를 열었을 때</w:t>
       </w:r>
     </w:p>
     <w:p>
@@ -3162,7 +3004,7 @@
           <w:color w:val="2E74B5"/>
           <w:sz w:val="26"/>
         </w:rPr>
-        <w:t>근무 시작</w:t>
+        <w:t>먼저 보면 좋은 곳</w:t>
       </w:r>
     </w:p>
     <w:p>
@@ -3244,7 +3086,7 @@
         <w:rPr>
           <w:rFonts w:ascii="Malgun Gothic" w:hAnsi="Malgun Gothic" w:eastAsia="Malgun Gothic" w:cs="Malgun Gothic"/>
         </w:rPr>
-        <w:t>이전 관리자 인수인계 메모와 처리 중 접수번호를 확인한다.</w:t>
+        <w:t>다른 관리자가 이미 보고 있는 접수번호가 있는지 확인한다.</w:t>
       </w:r>
     </w:p>
     <w:p>
@@ -3257,7 +3099,7 @@
           <w:color w:val="2E74B5"/>
           <w:sz w:val="26"/>
         </w:rPr>
-        <w:t>근무 종료</w:t>
+        <w:t>처리를 마쳤을 때</w:t>
       </w:r>
     </w:p>
     <w:p>
@@ -3268,7 +3110,7 @@
         <w:rPr>
           <w:rFonts w:ascii="Malgun Gothic" w:hAnsi="Malgun Gothic" w:eastAsia="Malgun Gothic" w:cs="Malgun Gothic"/>
         </w:rPr>
-        <w:t>처리한 접수번호와 결과를 인수인계에 남긴다.</w:t>
+        <w:t>여러 사람이 알아야 하는 처리라면 접수번호와 결과를 운영진 방에 남긴다.</w:t>
       </w:r>
     </w:p>
     <w:p>
@@ -3279,7 +3121,7 @@
         <w:rPr>
           <w:rFonts w:ascii="Malgun Gothic" w:hAnsi="Malgun Gothic" w:eastAsia="Malgun Gothic" w:cs="Malgun Gothic"/>
         </w:rPr>
-        <w:t>보류 건은 보류 이유와 필요한 추가 근거를 적는다.</w:t>
+        <w:t>보류 건은 이유와 추가로 필요한 내용을 짧게 적는다.</w:t>
       </w:r>
     </w:p>
     <w:p>
@@ -7519,7 +7361,7 @@
           <w:color w:val="2E74B5"/>
           <w:sz w:val="32"/>
         </w:rPr>
-        <w:t>14. 관리자 실습 시나리오</w:t>
+        <w:t>14. 함께 해보면 좋은 예시</w:t>
       </w:r>
     </w:p>
     <w:p>
@@ -7540,7 +7382,7 @@
         <w:rPr>
           <w:rFonts w:ascii="Malgun Gothic" w:hAnsi="Malgun Gothic" w:eastAsia="Malgun Gothic" w:cs="Malgun Gothic"/>
         </w:rPr>
-        <w:t xml:space="preserve">목표: </w:t>
+        <w:t xml:space="preserve">해볼 일: </w:t>
       </w:r>
       <w:r>
         <w:rPr>
@@ -7582,7 +7424,7 @@
         <w:rPr>
           <w:rFonts w:ascii="Malgun Gothic" w:hAnsi="Malgun Gothic" w:eastAsia="Malgun Gothic" w:cs="Malgun Gothic"/>
         </w:rPr>
-        <w:t>의 용도를 설명한다.</w:t>
+        <w:t>의 용도를 서로 설명해 본다.</w:t>
       </w:r>
     </w:p>
     <w:p>
@@ -7590,7 +7432,7 @@
         <w:rPr>
           <w:rFonts w:ascii="Malgun Gothic" w:hAnsi="Malgun Gothic" w:eastAsia="Malgun Gothic" w:cs="Malgun Gothic"/>
         </w:rPr>
-        <w:t>합격 기준: 봇 버전과 사이트 도움말 주소를 확인하고, 명령 오류 시 로그 위치를 찾는다.</w:t>
+        <w:t>확인할 점: 봇 버전과 사이트 도움말 주소를 확인하고, 명령 오류 시 로그 위치를 찾을 수 있는지 본다.</w:t>
       </w:r>
     </w:p>
     <w:p>
@@ -7611,7 +7453,7 @@
         <w:rPr>
           <w:rFonts w:ascii="Malgun Gothic" w:hAnsi="Malgun Gothic" w:eastAsia="Malgun Gothic" w:cs="Malgun Gothic"/>
         </w:rPr>
-        <w:t>목표: 테스트 파티를 만들고 모집번호를 유지한 채 참가자 한 명을 추가한다.</w:t>
+        <w:t>해볼 일: 테스트 파티를 만들고 모집번호를 유지한 채 참가자 한 명을 추가한다.</w:t>
       </w:r>
     </w:p>
     <w:p>
@@ -7619,7 +7461,7 @@
         <w:rPr>
           <w:rFonts w:ascii="Malgun Gothic" w:hAnsi="Malgun Gothic" w:eastAsia="Malgun Gothic" w:cs="Malgun Gothic"/>
         </w:rPr>
-        <w:t>합격 기준: 새 구인으로 중복 생성하지 않고 같은 모집번호의 인원만 변경한다.</w:t>
+        <w:t>확인할 점: 새 구인으로 중복 생성하지 않고 같은 모집번호의 인원만 변경되는지 본다.</w:t>
       </w:r>
     </w:p>
     <w:p>
@@ -7640,7 +7482,7 @@
         <w:rPr>
           <w:rFonts w:ascii="Malgun Gothic" w:hAnsi="Malgun Gothic" w:eastAsia="Malgun Gothic" w:cs="Malgun Gothic"/>
         </w:rPr>
-        <w:t>목표: 테스트 대상에게 근거사진 0장 일반 경고 양식을 접수하고 상태를 조회한다.</w:t>
+        <w:t>해볼 일: 테스트 대상에게 근거사진 0장 일반 경고 양식을 접수하고 상태를 조회한다.</w:t>
       </w:r>
     </w:p>
     <w:p>
@@ -7648,7 +7490,7 @@
         <w:rPr>
           <w:rFonts w:ascii="Malgun Gothic" w:hAnsi="Malgun Gothic" w:eastAsia="Malgun Gothic" w:cs="Malgun Gothic"/>
         </w:rPr>
-        <w:t xml:space="preserve">합격 기준: 경고 사유를 카카오에 쓰지 않고 </w:t>
+        <w:t xml:space="preserve">확인할 점: 경고 사유를 카카오에 쓰지 않고 </w:t>
       </w:r>
       <w:r>
         <w:rPr>
@@ -7662,7 +7504,7 @@
         <w:rPr>
           <w:rFonts w:ascii="Malgun Gothic" w:hAnsi="Malgun Gothic" w:eastAsia="Malgun Gothic" w:cs="Malgun Gothic"/>
         </w:rPr>
-        <w:t xml:space="preserve"> 상태가 검토 대기임을 설명한다.</w:t>
+        <w:t xml:space="preserve"> 상태가 검토 대기임을 설명할 수 있는지 본다.</w:t>
       </w:r>
     </w:p>
     <w:p>
@@ -7683,7 +7525,7 @@
         <w:rPr>
           <w:rFonts w:ascii="Malgun Gothic" w:hAnsi="Malgun Gothic" w:eastAsia="Malgun Gothic" w:cs="Malgun Gothic"/>
         </w:rPr>
-        <w:t>목표: 교육용 접수의 대상, 구분, 날짜, 증빙을 검토한다.</w:t>
+        <w:t>해볼 일: 테스트 접수의 대상, 구분, 날짜, 증빙을 같이 검토한다.</w:t>
       </w:r>
     </w:p>
     <w:p>
@@ -7691,7 +7533,7 @@
         <w:rPr>
           <w:rFonts w:ascii="Malgun Gothic" w:hAnsi="Malgun Gothic" w:eastAsia="Malgun Gothic" w:cs="Malgun Gothic"/>
         </w:rPr>
-        <w:t>합격 기준: 승인·반려 근거를 말하고 일반 10장·내전 15장 목표를 구분한다. 실제 승인 실행은 교육 진행자 지시에 따른다.</w:t>
+        <w:t>확인할 점: 승인·반려 근거를 말하고 일반 10장·내전 15장 목표를 구분한다. 실제 승인 실행은 함께 설명하는 관리자가 지정한 테스트 대상에만 한다.</w:t>
       </w:r>
     </w:p>
     <w:p>
@@ -7712,7 +7554,7 @@
         <w:rPr>
           <w:rFonts w:ascii="Malgun Gothic" w:hAnsi="Malgun Gothic" w:eastAsia="Malgun Gothic" w:cs="Malgun Gothic"/>
         </w:rPr>
-        <w:t xml:space="preserve">목표: </w:t>
+        <w:t xml:space="preserve">해볼 일: </w:t>
       </w:r>
       <w:r>
         <w:rPr>
@@ -7734,7 +7576,7 @@
         <w:rPr>
           <w:rFonts w:ascii="Malgun Gothic" w:hAnsi="Malgun Gothic" w:eastAsia="Malgun Gothic" w:cs="Malgun Gothic"/>
         </w:rPr>
-        <w:t>합격 기준: 2세트 2장, 3세트 3장과 사진 순서를 설명하고 수기 등록 시작 위치를 찾는다.</w:t>
+        <w:t>확인할 점: 2세트 2장, 3세트 3장과 사진 순서를 설명하고 수기 등록 시작 위치를 찾을 수 있는지 본다.</w:t>
       </w:r>
     </w:p>
     <w:p>
@@ -7755,7 +7597,7 @@
         <w:rPr>
           <w:rFonts w:ascii="Malgun Gothic" w:hAnsi="Malgun Gothic" w:eastAsia="Malgun Gothic" w:cs="Malgun Gothic"/>
         </w:rPr>
-        <w:t>목표: 사진 저장 오류를 장애 보고 양식으로 정리한다.</w:t>
+        <w:t>해볼 일: 사진 저장 오류를 장애 공유 양식으로 정리한다.</w:t>
       </w:r>
     </w:p>
     <w:p>
@@ -7763,7 +7605,7 @@
         <w:rPr>
           <w:rFonts w:ascii="Malgun Gothic" w:hAnsi="Malgun Gothic" w:eastAsia="Malgun Gothic" w:cs="Malgun Gothic"/>
         </w:rPr>
-        <w:t>합격 기준: 토큰을 노출하지 않고 시간, 방, 보낸 사람, 명령, 접수번호, 실제·기대 결과를 기록한다.</w:t>
+        <w:t>확인할 점: 토큰을 노출하지 않고 시간, 방, 보낸 사람, 명령, 접수번호, 실제·기대 결과를 기록했는지 본다.</w:t>
       </w:r>
     </w:p>
     <w:p>
@@ -7781,7 +7623,15 @@
           <w:color w:val="2E74B5"/>
           <w:sz w:val="32"/>
         </w:rPr>
-        <w:t>15. 관리자 수료 체크리스트</w:t>
+        <w:t>15. 설명을 마치기 전 같이 확인할 내용</w:t>
+      </w:r>
+    </w:p>
+    <w:p>
+      <w:r>
+        <w:rPr>
+          <w:rFonts w:ascii="Malgun Gothic" w:hAnsi="Malgun Gothic" w:eastAsia="Malgun Gothic" w:cs="Malgun Gothic"/>
+        </w:rPr>
+        <w:t>시험이나 수료 기준이 아니다. 처음 안내받은 관리자가 헷갈리는 부분이 없는지 대화하면서 확인하는 목록이다.</w:t>
       </w:r>
     </w:p>
     <w:p>
@@ -7957,7 +7807,7 @@
         <w:rPr>
           <w:rFonts w:ascii="Malgun Gothic" w:hAnsi="Malgun Gothic" w:eastAsia="Malgun Gothic" w:cs="Malgun Gothic"/>
         </w:rPr>
-        <w:t>보류·반려·승인 판단 근거를 인수인계에 남길 수 있다.</w:t>
+        <w:t>보류·반려·승인 판단 근거를 다른 운영진이 알 수 있게 남길 수 있다.</w:t>
       </w:r>
     </w:p>
     <w:p>
@@ -7965,7 +7815,7 @@
         <w:rPr>
           <w:rFonts w:ascii="Malgun Gothic" w:hAnsi="Malgun Gothic" w:eastAsia="Malgun Gothic" w:cs="Malgun Gothic"/>
         </w:rPr>
-        <w:t>교육 진행자는 실습 결과를 확인한 뒤 관리자 권한 부여 또는 단독 근무 가능 여부를 결정한다.</w:t>
+        <w:t>모르는 항목은 그 자리에서 다시 화면을 열어 함께 확인한다. 모든 메뉴를 외우는 것보다, 애매할 때 누구에게 물어보고 어디에서 기록을 찾는지 아는 것이 더 중요하다.</w:t>
       </w:r>
     </w:p>
     <w:p>
@@ -7997,7 +7847,7 @@
           <w:color w:val="0B2545"/>
           <w:sz w:val="17"/>
         </w:rPr>
-        <w:t>[관리자 근무 시작]</w:t>
+        <w:t>[관리 페이지를 열었을 때]</w:t>
       </w:r>
       <w:r>
         <w:br/>
@@ -8052,7 +7902,7 @@
           <w:color w:val="0B2545"/>
           <w:sz w:val="17"/>
         </w:rPr>
-        <w:t>5. 인수인계 접수번호 확인</w:t>
+        <w:t>5. 다른 관리자가 확인 중인 접수번호가 있는지 확인</w:t>
       </w:r>
       <w:r>
         <w:br/>
@@ -9083,7 +8933,7 @@
         <w:rPr>
           <w:rFonts w:ascii="Malgun Gothic" w:hAnsi="Malgun Gothic" w:eastAsia="Malgun Gothic" w:cs="Malgun Gothic"/>
         </w:rPr>
-        <w:t>이 교육자료의 이미지 중 다음 3장은 실제 이용자 이름이나 관리자 전용 데이터가 없는 모바일 안내 화면으로 만들어 유저 공지에 재사용할 수 있다.</w:t>
+        <w:t>이 가이드의 이미지 중 다음 3장은 실제 이용자 이름이나 관리자 전용 데이터가 없는 모바일 안내 화면으로 만들어 유저 공지에 재사용할 수 있다.</w:t>
       </w:r>
     </w:p>
     <w:tbl>
@@ -9734,7 +9584,7 @@
         <w:color w:val="5C6773"/>
         <w:sz w:val="17"/>
       </w:rPr>
-      <w:t>K-LOL.GG | 관리자 기능 교육자료</w:t>
+      <w:t>K-LOL.GG | 운영진 기능 가이드</w:t>
     </w:r>
   </w:p>
 </w:hdr>

</xml_diff>